<commit_message>
Add footnotes, fix novelty/p-values/definitions, add defense slides and Q&A document
Co-Authored-By: Claude Sonnet 5.5 <noreply@anthropic.com>
Claude-Session: https://claude.ai/code/session_01HyFWAB39WmS1ZksM98KWV6
</commit_message>
<xml_diff>
--- a/گزارش_اصلاحات_داوران.docx
+++ b/گزارش_اصلاحات_داوران.docx
@@ -46,7 +46,7 @@
           <w:szCs w:val="24"/>
           <w:rtl/>
         </w:rPr>
-        <w:t xml:space="preserve">ساختار جدول: نظر داور ← اصلاح انجام‌شده ← متن اصلاح‌شده ← بخش و شماره صفحه در «رسالهٔ اصلاح‌شده». شماره صفحه‌ها بر پایهٔ نسخهٔ اصلاح‌شده (کل رساله حدود 142 صفحه) درج شده است. با توجه به تفاوت فونت‌ها و تنظیمات صفحه در رایانه‌های مختلف، پس از باز کردن فایل در </w:t>
+        <w:t xml:space="preserve">ساختار جدول: نظر داور ← اصلاح انجام‌شده ← متن اصلاح‌شده ← بخش و شماره صفحه در «رسالهٔ اصلاح‌شده». شماره صفحه‌ها بر پایهٔ نسخهٔ اصلاح‌شده (کل رساله حدود 145 صفحه) درج شده است. با توجه به تفاوت فونت‌ها و تنظیمات صفحه در رایانه‌های مختلف، پس از باز کردن فایل در </w:t>
       </w:r>
       <w:r>
         <w:rPr>
@@ -412,7 +412,7 @@
                 <w:szCs w:val="20"/>
                 <w:rtl/>
               </w:rPr>
-              <w:t xml:space="preserve">122 تا 128</w:t>
+              <w:t xml:space="preserve">126 تا 132</w:t>
             </w:r>
           </w:p>
         </w:tc>
@@ -953,7 +953,7 @@
                 <w:szCs w:val="20"/>
                 <w:rtl/>
               </w:rPr>
-              <w:t xml:space="preserve">142</w:t>
+              <w:t xml:space="preserve">145</w:t>
             </w:r>
           </w:p>
         </w:tc>
@@ -1114,7 +1114,7 @@
                 <w:szCs w:val="20"/>
                 <w:rtl/>
               </w:rPr>
-              <w:t xml:space="preserve">فصل 1: 18 | فصل 2: 75 | فصل 3: 89 | فصل 4: 107 | فصل 5: 120</w:t>
+              <w:t xml:space="preserve">فصل 1: 19 | فصل 2: 78 | فصل 3: 93 | فصل 4: 111 | فصل 5: 124</w:t>
             </w:r>
           </w:p>
         </w:tc>
@@ -1260,7 +1260,7 @@
                 <w:szCs w:val="20"/>
                 <w:rtl/>
               </w:rPr>
-              <w:t xml:space="preserve">70 تا 75</w:t>
+              <w:t xml:space="preserve">73 تا 78</w:t>
             </w:r>
           </w:p>
         </w:tc>
@@ -1406,7 +1406,7 @@
                 <w:szCs w:val="20"/>
                 <w:rtl/>
               </w:rPr>
-              <w:t xml:space="preserve">78</w:t>
+              <w:t xml:space="preserve">81</w:t>
             </w:r>
           </w:p>
         </w:tc>
@@ -1597,7 +1597,7 @@
                 <w:szCs w:val="20"/>
                 <w:rtl/>
               </w:rPr>
-              <w:t xml:space="preserve">79 و 15</w:t>
+              <w:t xml:space="preserve">82 و 16</w:t>
             </w:r>
           </w:p>
         </w:tc>
@@ -1833,7 +1833,7 @@
                 <w:szCs w:val="20"/>
                 <w:rtl/>
               </w:rPr>
-              <w:t xml:space="preserve">81</w:t>
+              <w:t xml:space="preserve">84</w:t>
             </w:r>
           </w:p>
         </w:tc>
@@ -2009,7 +2009,7 @@
                 <w:szCs w:val="20"/>
                 <w:rtl/>
               </w:rPr>
-              <w:t xml:space="preserve">84</w:t>
+              <w:t xml:space="preserve">88</w:t>
             </w:r>
           </w:p>
         </w:tc>
@@ -2230,7 +2230,7 @@
                 <w:szCs w:val="20"/>
                 <w:rtl/>
               </w:rPr>
-              <w:t xml:space="preserve">87</w:t>
+              <w:t xml:space="preserve">91</w:t>
             </w:r>
           </w:p>
         </w:tc>
@@ -2434,7 +2434,7 @@
                 <w:szCs w:val="20"/>
                 <w:rtl/>
               </w:rPr>
-              <w:t xml:space="preserve">85</w:t>
+              <w:t xml:space="preserve">89</w:t>
             </w:r>
           </w:p>
         </w:tc>
@@ -2700,7 +2700,7 @@
                 <w:szCs w:val="20"/>
                 <w:rtl/>
               </w:rPr>
-              <w:t xml:space="preserve">85</w:t>
+              <w:t xml:space="preserve">89</w:t>
             </w:r>
           </w:p>
         </w:tc>
@@ -2831,7 +2831,7 @@
                 <w:szCs w:val="20"/>
                 <w:rtl/>
               </w:rPr>
-              <w:t xml:space="preserve">78، 80، 89، 91، 110، 7</w:t>
+              <w:t xml:space="preserve">81، 83، 93، 95، 114، 7</w:t>
             </w:r>
           </w:p>
         </w:tc>
@@ -3022,7 +3022,7 @@
                 <w:szCs w:val="20"/>
                 <w:rtl/>
               </w:rPr>
-              <w:t xml:space="preserve">91 تا 107</w:t>
+              <w:t xml:space="preserve">95 تا 111</w:t>
             </w:r>
           </w:p>
         </w:tc>
@@ -3183,7 +3183,7 @@
                 <w:szCs w:val="20"/>
                 <w:rtl/>
               </w:rPr>
-              <w:t xml:space="preserve">107</w:t>
+              <w:t xml:space="preserve">111</w:t>
             </w:r>
           </w:p>
         </w:tc>
@@ -3314,7 +3314,7 @@
                 <w:szCs w:val="20"/>
                 <w:rtl/>
               </w:rPr>
-              <w:t xml:space="preserve">110؛ جدول 5-2: 116</w:t>
+              <w:t xml:space="preserve">114؛ جدول 5-2: 120</w:t>
             </w:r>
           </w:p>
         </w:tc>
@@ -4144,6 +4144,420 @@
                 <w:szCs w:val="20"/>
                 <w:rtl/>
               </w:rPr>
+              <w:t xml:space="preserve">پاورقی‌ها</w:t>
+            </w:r>
+          </w:p>
+        </w:tc>
+        <w:tc>
+          <w:tcPr>
+            <w:tcW w:w="10100" w:type="dxa"/>
+            <w:vAlign w:val="center"/>
+          </w:tcPr>
+          <w:p>
+            <w:pPr>
+              <w:bidi/>
+              <w:spacing w:before="40" w:after="40" w:line="260" w:lineRule="auto"/>
+              <w:jc w:val="both"/>
+            </w:pPr>
+            <w:r>
+              <w:rPr>
+                <w:rFonts w:ascii="Times New Roman" w:hAnsi="Times New Roman" w:cs="B Lotus"/>
+                <w:szCs w:val="20"/>
+                <w:rtl/>
+              </w:rPr>
+              <w:t xml:space="preserve">پاورقی‌های رساله (نام لاتین نویسندگان و معادل لاتین اصطلاحات و نظریه‌ها، مثلاً </w:t>
+            </w:r>
+            <w:r>
+              <w:rPr>
+                <w:rFonts w:ascii="Times New Roman" w:hAnsi="Times New Roman" w:cs="B Lotus"/>
+                <w:szCs w:val="20"/>
+              </w:rPr>
+              <w:t xml:space="preserve">DeAngelo</w:t>
+            </w:r>
+            <w:r>
+              <w:rPr>
+                <w:rFonts w:ascii="Times New Roman" w:hAnsi="Times New Roman" w:cs="B Lotus"/>
+                <w:szCs w:val="20"/>
+                <w:rtl/>
+              </w:rPr>
+              <w:t xml:space="preserve">، </w:t>
+            </w:r>
+            <w:r>
+              <w:rPr>
+                <w:rFonts w:ascii="Times New Roman" w:hAnsi="Times New Roman" w:cs="B Lotus"/>
+                <w:szCs w:val="20"/>
+              </w:rPr>
+              <w:t xml:space="preserve">Cho et al</w:t>
+            </w:r>
+            <w:r>
+              <w:rPr>
+                <w:rFonts w:ascii="Times New Roman" w:hAnsi="Times New Roman" w:cs="B Lotus"/>
+                <w:szCs w:val="20"/>
+                <w:rtl/>
+              </w:rPr>
+              <w:t xml:space="preserve">.، </w:t>
+            </w:r>
+            <w:r>
+              <w:rPr>
+                <w:rFonts w:ascii="Times New Roman" w:hAnsi="Times New Roman" w:cs="B Lotus"/>
+                <w:szCs w:val="20"/>
+              </w:rPr>
+              <w:t xml:space="preserve">Low-balling</w:t>
+            </w:r>
+            <w:r>
+              <w:rPr>
+                <w:rFonts w:ascii="Times New Roman" w:hAnsi="Times New Roman" w:cs="B Lotus"/>
+                <w:szCs w:val="20"/>
+                <w:rtl/>
+              </w:rPr>
+              <w:t xml:space="preserve">، </w:t>
+            </w:r>
+            <w:r>
+              <w:rPr>
+                <w:rFonts w:ascii="Times New Roman" w:hAnsi="Times New Roman" w:cs="B Lotus"/>
+                <w:szCs w:val="20"/>
+              </w:rPr>
+              <w:t xml:space="preserve">Cross-subsidization</w:t>
+            </w:r>
+            <w:r>
+              <w:rPr>
+                <w:rFonts w:ascii="Times New Roman" w:hAnsi="Times New Roman" w:cs="B Lotus"/>
+                <w:szCs w:val="20"/>
+                <w:rtl/>
+              </w:rPr>
+              <w:t xml:space="preserve">، </w:t>
+            </w:r>
+            <w:r>
+              <w:rPr>
+                <w:rFonts w:ascii="Times New Roman" w:hAnsi="Times New Roman" w:cs="B Lotus"/>
+                <w:szCs w:val="20"/>
+              </w:rPr>
+              <w:t xml:space="preserve">Fixed effects)</w:t>
+            </w:r>
+            <w:r>
+              <w:rPr>
+                <w:rFonts w:ascii="Times New Roman" w:hAnsi="Times New Roman" w:cs="B Lotus"/>
+                <w:szCs w:val="20"/>
+                <w:rtl/>
+              </w:rPr>
+              <w:t xml:space="preserve"> در فصل‌های 1 تا 5 بازگردانده و گسترش داده شد (حدود 240 پاورقی؛ هر نویسنده یا اصطلاح در هر فصل برای نخستین بار).</w:t>
+            </w:r>
+          </w:p>
+        </w:tc>
+      </w:tr>
+      <w:tr>
+        <w:trPr>
+          <w:cantSplit/>
+        </w:trPr>
+        <w:tc>
+          <w:tcPr>
+            <w:tcW w:w="800" w:type="dxa"/>
+            <w:vAlign w:val="center"/>
+          </w:tcPr>
+          <w:p>
+            <w:pPr>
+              <w:bidi/>
+              <w:spacing w:before="40" w:after="40" w:line="260" w:lineRule="auto"/>
+              <w:jc w:val="center"/>
+            </w:pPr>
+            <w:r>
+              <w:rPr>
+                <w:rFonts w:ascii="Times New Roman" w:hAnsi="Times New Roman" w:cs="B Lotus"/>
+                <w:szCs w:val="20"/>
+                <w:rtl/>
+              </w:rPr>
+              <w:t xml:space="preserve">9</w:t>
+            </w:r>
+          </w:p>
+        </w:tc>
+        <w:tc>
+          <w:tcPr>
+            <w:tcW w:w="3000" w:type="dxa"/>
+            <w:vAlign w:val="center"/>
+          </w:tcPr>
+          <w:p>
+            <w:pPr>
+              <w:bidi/>
+              <w:spacing w:before="40" w:after="40" w:line="260" w:lineRule="auto"/>
+              <w:jc w:val="both"/>
+            </w:pPr>
+            <w:r>
+              <w:rPr>
+                <w:rFonts w:ascii="Times New Roman" w:hAnsi="Times New Roman" w:cs="B Lotus"/>
+                <w:szCs w:val="20"/>
+                <w:rtl/>
+              </w:rPr>
+              <w:t xml:space="preserve">بند نوآوری فصل 1 (1-6)</w:t>
+            </w:r>
+          </w:p>
+        </w:tc>
+        <w:tc>
+          <w:tcPr>
+            <w:tcW w:w="10100" w:type="dxa"/>
+            <w:vAlign w:val="center"/>
+          </w:tcPr>
+          <w:p>
+            <w:pPr>
+              <w:bidi/>
+              <w:spacing w:before="40" w:after="40" w:line="260" w:lineRule="auto"/>
+              <w:jc w:val="both"/>
+            </w:pPr>
+            <w:r>
+              <w:rPr>
+                <w:rFonts w:ascii="Times New Roman" w:hAnsi="Times New Roman" w:cs="B Lotus"/>
+                <w:szCs w:val="20"/>
+                <w:rtl/>
+              </w:rPr>
+              <w:t xml:space="preserve">عبارت «روش داده‌بنیاد و بخش کیفی» و «تجربیات و قضاوت حرفه‌ای حسابرسان» از بند 1-6 و عبارت «رویکرد داده‌بنیاد» از بیان مسئله حذف و بند با نوع پژوهش کمّی فصل 3 هماهنگ شد.</w:t>
+            </w:r>
+          </w:p>
+        </w:tc>
+      </w:tr>
+      <w:tr>
+        <w:trPr>
+          <w:cantSplit/>
+        </w:trPr>
+        <w:tc>
+          <w:tcPr>
+            <w:tcW w:w="800" w:type="dxa"/>
+            <w:vAlign w:val="center"/>
+          </w:tcPr>
+          <w:p>
+            <w:pPr>
+              <w:bidi/>
+              <w:spacing w:before="40" w:after="40" w:line="260" w:lineRule="auto"/>
+              <w:jc w:val="center"/>
+            </w:pPr>
+            <w:r>
+              <w:rPr>
+                <w:rFonts w:ascii="Times New Roman" w:hAnsi="Times New Roman" w:cs="B Lotus"/>
+                <w:szCs w:val="20"/>
+                <w:rtl/>
+              </w:rPr>
+              <w:t xml:space="preserve">10</w:t>
+            </w:r>
+          </w:p>
+        </w:tc>
+        <w:tc>
+          <w:tcPr>
+            <w:tcW w:w="3000" w:type="dxa"/>
+            <w:vAlign w:val="center"/>
+          </w:tcPr>
+          <w:p>
+            <w:pPr>
+              <w:bidi/>
+              <w:spacing w:before="40" w:after="40" w:line="260" w:lineRule="auto"/>
+              <w:jc w:val="both"/>
+            </w:pPr>
+            <w:r>
+              <w:rPr>
+                <w:rFonts w:ascii="Times New Roman" w:hAnsi="Times New Roman" w:cs="B Lotus"/>
+                <w:szCs w:val="20"/>
+                <w:rtl/>
+              </w:rPr>
+              <w:t xml:space="preserve">مقادیر احتمال (</w:t>
+            </w:r>
+            <w:r>
+              <w:rPr>
+                <w:rFonts w:ascii="Times New Roman" w:hAnsi="Times New Roman" w:cs="B Lotus"/>
+                <w:szCs w:val="20"/>
+              </w:rPr>
+              <w:t xml:space="preserve">p-value)</w:t>
+            </w:r>
+            <w:r>
+              <w:rPr>
+                <w:rFonts w:ascii="Times New Roman" w:hAnsi="Times New Roman" w:cs="B Lotus"/>
+                <w:szCs w:val="20"/>
+                <w:rtl/>
+              </w:rPr>
+              <w:t xml:space="preserve"> و پیوست</w:t>
+            </w:r>
+          </w:p>
+        </w:tc>
+        <w:tc>
+          <w:tcPr>
+            <w:tcW w:w="10100" w:type="dxa"/>
+            <w:vAlign w:val="center"/>
+          </w:tcPr>
+          <w:p>
+            <w:pPr>
+              <w:bidi/>
+              <w:spacing w:before="40" w:after="40" w:line="260" w:lineRule="auto"/>
+              <w:jc w:val="both"/>
+            </w:pPr>
+            <w:r>
+              <w:rPr>
+                <w:rFonts w:ascii="Times New Roman" w:hAnsi="Times New Roman" w:cs="B Lotus"/>
+                <w:szCs w:val="20"/>
+                <w:rtl/>
+              </w:rPr>
+              <w:t xml:space="preserve">ضرایب، خطای استاندارد و آمارهٔ </w:t>
+            </w:r>
+            <w:r>
+              <w:rPr>
+                <w:rFonts w:ascii="Times New Roman" w:hAnsi="Times New Roman" w:cs="B Lotus"/>
+                <w:szCs w:val="20"/>
+              </w:rPr>
+              <w:t xml:space="preserve">t</w:t>
+            </w:r>
+            <w:r>
+              <w:rPr>
+                <w:rFonts w:ascii="Times New Roman" w:hAnsi="Times New Roman" w:cs="B Lotus"/>
+                <w:szCs w:val="20"/>
+                <w:rtl/>
+              </w:rPr>
+              <w:t xml:space="preserve"> جدول‌های 4-10 تا 4-14 با خروجی ایویوز پیوست یک‌به‌یک مطابقت داده شد و همه برابرند. اما چهار مقدار احتمال در متن و پیوست (</w:t>
+            </w:r>
+            <w:r>
+              <w:rPr>
+                <w:rFonts w:ascii="Times New Roman" w:hAnsi="Times New Roman" w:cs="B Lotus"/>
+                <w:szCs w:val="20"/>
+              </w:rPr>
+              <w:t xml:space="preserve">NASR: 0.2374</w:t>
+            </w:r>
+            <w:r>
+              <w:rPr>
+                <w:rFonts w:ascii="Times New Roman" w:hAnsi="Times New Roman" w:cs="B Lotus"/>
+                <w:szCs w:val="20"/>
+                <w:rtl/>
+              </w:rPr>
+              <w:t xml:space="preserve">؛ </w:t>
+            </w:r>
+            <w:r>
+              <w:rPr>
+                <w:rFonts w:ascii="Times New Roman" w:hAnsi="Times New Roman" w:cs="B Lotus"/>
+                <w:szCs w:val="20"/>
+              </w:rPr>
+              <w:t xml:space="preserve">COMPLEX: 0.0213</w:t>
+            </w:r>
+            <w:r>
+              <w:rPr>
+                <w:rFonts w:ascii="Times New Roman" w:hAnsi="Times New Roman" w:cs="B Lotus"/>
+                <w:szCs w:val="20"/>
+                <w:rtl/>
+              </w:rPr>
+              <w:t xml:space="preserve">؛ </w:t>
+            </w:r>
+            <w:r>
+              <w:rPr>
+                <w:rFonts w:ascii="Times New Roman" w:hAnsi="Times New Roman" w:cs="B Lotus"/>
+                <w:szCs w:val="20"/>
+              </w:rPr>
+              <w:t xml:space="preserve">COMPLEX×BIG4: 0.0106</w:t>
+            </w:r>
+            <w:r>
+              <w:rPr>
+                <w:rFonts w:ascii="Times New Roman" w:hAnsi="Times New Roman" w:cs="B Lotus"/>
+                <w:szCs w:val="20"/>
+                <w:rtl/>
+              </w:rPr>
+              <w:t xml:space="preserve">؛ </w:t>
+            </w:r>
+            <w:r>
+              <w:rPr>
+                <w:rFonts w:ascii="Times New Roman" w:hAnsi="Times New Roman" w:cs="B Lotus"/>
+                <w:szCs w:val="20"/>
+              </w:rPr>
+              <w:t xml:space="preserve">COSTP: 0.2540)</w:t>
+            </w:r>
+            <w:r>
+              <w:rPr>
+                <w:rFonts w:ascii="Times New Roman" w:hAnsi="Times New Roman" w:cs="B Lotus"/>
+                <w:szCs w:val="20"/>
+                <w:rtl/>
+              </w:rPr>
+              <w:t xml:space="preserve"> با آمارهٔ </w:t>
+            </w:r>
+            <w:r>
+              <w:rPr>
+                <w:rFonts w:ascii="Times New Roman" w:hAnsi="Times New Roman" w:cs="B Lotus"/>
+                <w:szCs w:val="20"/>
+              </w:rPr>
+              <w:t xml:space="preserve">t</w:t>
+            </w:r>
+            <w:r>
+              <w:rPr>
+                <w:rFonts w:ascii="Times New Roman" w:hAnsi="Times New Roman" w:cs="B Lotus"/>
+                <w:szCs w:val="20"/>
+                <w:rtl/>
+              </w:rPr>
+              <w:t xml:space="preserve"> و درجهٔ آزادی خودشان سازگار نبود (سایر </w:t>
+            </w:r>
+            <w:r>
+              <w:rPr>
+                <w:rFonts w:ascii="Times New Roman" w:hAnsi="Times New Roman" w:cs="B Lotus"/>
+                <w:szCs w:val="20"/>
+              </w:rPr>
+              <w:t xml:space="preserve">p-value</w:t>
+            </w:r>
+            <w:r>
+              <w:rPr>
+                <w:rFonts w:ascii="Times New Roman" w:hAnsi="Times New Roman" w:cs="B Lotus"/>
+                <w:szCs w:val="20"/>
+                <w:rtl/>
+              </w:rPr>
+              <w:t xml:space="preserve">ها دقیقاً با </w:t>
+            </w:r>
+            <w:r>
+              <w:rPr>
+                <w:rFonts w:ascii="Times New Roman" w:hAnsi="Times New Roman" w:cs="B Lotus"/>
+                <w:szCs w:val="20"/>
+              </w:rPr>
+              <w:t xml:space="preserve">t</w:t>
+            </w:r>
+            <w:r>
+              <w:rPr>
+                <w:rFonts w:ascii="Times New Roman" w:hAnsi="Times New Roman" w:cs="B Lotus"/>
+                <w:szCs w:val="20"/>
+                <w:rtl/>
+              </w:rPr>
+              <w:t xml:space="preserve"> سازگارند). این چهار مقدار بازمحاسبه و در متن و پیوست اصلاح شد: 0.1151، 0.0108، 0.0071 و 0.4108. نتیجهٔ هیچ فرضیه‌ای تغییر نکرد.</w:t>
+            </w:r>
+          </w:p>
+        </w:tc>
+      </w:tr>
+      <w:tr>
+        <w:trPr>
+          <w:cantSplit/>
+        </w:trPr>
+        <w:tc>
+          <w:tcPr>
+            <w:tcW w:w="800" w:type="dxa"/>
+            <w:vAlign w:val="center"/>
+          </w:tcPr>
+          <w:p>
+            <w:pPr>
+              <w:bidi/>
+              <w:spacing w:before="40" w:after="40" w:line="260" w:lineRule="auto"/>
+              <w:jc w:val="center"/>
+            </w:pPr>
+            <w:r>
+              <w:rPr>
+                <w:rFonts w:ascii="Times New Roman" w:hAnsi="Times New Roman" w:cs="B Lotus"/>
+                <w:szCs w:val="20"/>
+                <w:rtl/>
+              </w:rPr>
+              <w:t xml:space="preserve">11</w:t>
+            </w:r>
+          </w:p>
+        </w:tc>
+        <w:tc>
+          <w:tcPr>
+            <w:tcW w:w="3000" w:type="dxa"/>
+            <w:vAlign w:val="center"/>
+          </w:tcPr>
+          <w:p>
+            <w:pPr>
+              <w:bidi/>
+              <w:spacing w:before="40" w:after="40" w:line="260" w:lineRule="auto"/>
+              <w:jc w:val="both"/>
+            </w:pPr>
+            <w:r>
+              <w:rPr>
+                <w:rFonts w:ascii="Times New Roman" w:hAnsi="Times New Roman" w:cs="B Lotus"/>
+                <w:szCs w:val="20"/>
+                <w:rtl/>
+              </w:rPr>
               <w:t xml:space="preserve">برچسب متغیرها</w:t>
             </w:r>
           </w:p>
@@ -4572,7 +4986,22 @@
                 <w:szCs w:val="20"/>
                 <w:rtl/>
               </w:rPr>
-              <w:t xml:space="preserve">احتمال‌های گزارش‌شده</w:t>
+              <w:t xml:space="preserve">تعریف </w:t>
+            </w:r>
+            <w:r>
+              <w:rPr>
+                <w:rFonts w:ascii="Times New Roman" w:hAnsi="Times New Roman" w:cs="B Lotus"/>
+                <w:szCs w:val="20"/>
+              </w:rPr>
+              <w:t xml:space="preserve">COMPLEX</w:t>
+            </w:r>
+            <w:r>
+              <w:rPr>
+                <w:rFonts w:ascii="Times New Roman" w:hAnsi="Times New Roman" w:cs="B Lotus"/>
+                <w:szCs w:val="20"/>
+                <w:rtl/>
+              </w:rPr>
+              <w:t xml:space="preserve"> و مدل هزینهٔ سال اول</w:t>
             </w:r>
           </w:p>
         </w:tc>
@@ -4593,14 +5022,14 @@
                 <w:szCs w:val="20"/>
                 <w:rtl/>
               </w:rPr>
-              <w:t xml:space="preserve">برخی مقادیر احتمال با آمارهٔ </w:t>
-            </w:r>
-            <w:r>
-              <w:rPr>
-                <w:rFonts w:ascii="Times New Roman" w:hAnsi="Times New Roman" w:cs="B Lotus"/>
-                <w:szCs w:val="20"/>
-              </w:rPr>
-              <w:t xml:space="preserve">t</w:t>
+              <w:t xml:space="preserve">بدون فایل داده، فقط سازگاری با پیوست سنجیده شد: همهٔ متغیرهای مدل 3-1 (</w:t>
+            </w:r>
+            <w:r>
+              <w:rPr>
+                <w:rFonts w:ascii="Times New Roman" w:hAnsi="Times New Roman" w:cs="B Lotus"/>
+                <w:szCs w:val="20"/>
+              </w:rPr>
+              <w:t xml:space="preserve">SIZE</w:t>
             </w:r>
             <w:r>
               <w:rPr>
@@ -4608,14 +5037,14 @@
                 <w:szCs w:val="20"/>
                 <w:rtl/>
               </w:rPr>
-              <w:t xml:space="preserve"> هم‌خوان نیستند (مثلاً مدل 1: </w:t>
-            </w:r>
-            <w:r>
-              <w:rPr>
-                <w:rFonts w:ascii="Times New Roman" w:hAnsi="Times New Roman" w:cs="B Lotus"/>
-                <w:szCs w:val="20"/>
-              </w:rPr>
-              <w:t xml:space="preserve">t</w:t>
+              <w:t xml:space="preserve">، </w:t>
+            </w:r>
+            <w:r>
+              <w:rPr>
+                <w:rFonts w:ascii="Times New Roman" w:hAnsi="Times New Roman" w:cs="B Lotus"/>
+                <w:szCs w:val="20"/>
+              </w:rPr>
+              <w:t xml:space="preserve">LEV</w:t>
             </w:r>
             <w:r>
               <w:rPr>
@@ -4623,14 +5052,14 @@
                 <w:szCs w:val="20"/>
                 <w:rtl/>
               </w:rPr>
-              <w:t xml:space="preserve">=−1.578 ولی </w:t>
-            </w:r>
-            <w:r>
-              <w:rPr>
-                <w:rFonts w:ascii="Times New Roman" w:hAnsi="Times New Roman" w:cs="B Lotus"/>
-                <w:szCs w:val="20"/>
-              </w:rPr>
-              <w:t xml:space="preserve">p=0.2374</w:t>
+              <w:t xml:space="preserve">، </w:t>
+            </w:r>
+            <w:r>
+              <w:rPr>
+                <w:rFonts w:ascii="Times New Roman" w:hAnsi="Times New Roman" w:cs="B Lotus"/>
+                <w:szCs w:val="20"/>
+              </w:rPr>
+              <w:t xml:space="preserve">ROA</w:t>
             </w:r>
             <w:r>
               <w:rPr>
@@ -4638,14 +5067,14 @@
                 <w:szCs w:val="20"/>
                 <w:rtl/>
               </w:rPr>
-              <w:t xml:space="preserve">؛ مدل 2: </w:t>
-            </w:r>
-            <w:r>
-              <w:rPr>
-                <w:rFonts w:ascii="Times New Roman" w:hAnsi="Times New Roman" w:cs="B Lotus"/>
-                <w:szCs w:val="20"/>
-              </w:rPr>
-              <w:t xml:space="preserve">t</w:t>
+              <w:t xml:space="preserve">، </w:t>
+            </w:r>
+            <w:r>
+              <w:rPr>
+                <w:rFonts w:ascii="Times New Roman" w:hAnsi="Times New Roman" w:cs="B Lotus"/>
+                <w:szCs w:val="20"/>
+              </w:rPr>
+              <w:t xml:space="preserve">GROWTH</w:t>
             </w:r>
             <w:r>
               <w:rPr>
@@ -4653,14 +5082,14 @@
                 <w:szCs w:val="20"/>
                 <w:rtl/>
               </w:rPr>
-              <w:t xml:space="preserve">=−2.554 ولی </w:t>
-            </w:r>
-            <w:r>
-              <w:rPr>
-                <w:rFonts w:ascii="Times New Roman" w:hAnsi="Times New Roman" w:cs="B Lotus"/>
-                <w:szCs w:val="20"/>
-              </w:rPr>
-              <w:t xml:space="preserve">p=0.0213)</w:t>
+              <w:t xml:space="preserve">، </w:t>
+            </w:r>
+            <w:r>
+              <w:rPr>
+                <w:rFonts w:ascii="Times New Roman" w:hAnsi="Times New Roman" w:cs="B Lotus"/>
+                <w:szCs w:val="20"/>
+              </w:rPr>
+              <w:t xml:space="preserve">RISK</w:t>
             </w:r>
             <w:r>
               <w:rPr>
@@ -4668,7 +5097,97 @@
                 <w:szCs w:val="20"/>
                 <w:rtl/>
               </w:rPr>
-              <w:t xml:space="preserve">. همان اعداد خروجی/متن قبلی حفظ شد؛ بهتر است از روی فایل ایویوز بازبینی شود.</w:t>
+              <w:t xml:space="preserve">، </w:t>
+            </w:r>
+            <w:r>
+              <w:rPr>
+                <w:rFonts w:ascii="Times New Roman" w:hAnsi="Times New Roman" w:cs="B Lotus"/>
+                <w:szCs w:val="20"/>
+              </w:rPr>
+              <w:t xml:space="preserve">BIG4</w:t>
+            </w:r>
+            <w:r>
+              <w:rPr>
+                <w:rFonts w:ascii="Times New Roman" w:hAnsi="Times New Roman" w:cs="B Lotus"/>
+                <w:szCs w:val="20"/>
+                <w:rtl/>
+              </w:rPr>
+              <w:t xml:space="preserve">، </w:t>
+            </w:r>
+            <w:r>
+              <w:rPr>
+                <w:rFonts w:ascii="Times New Roman" w:hAnsi="Times New Roman" w:cs="B Lotus"/>
+                <w:szCs w:val="20"/>
+              </w:rPr>
+              <w:t xml:space="preserve">TENURE)</w:t>
+            </w:r>
+            <w:r>
+              <w:rPr>
+                <w:rFonts w:ascii="Times New Roman" w:hAnsi="Times New Roman" w:cs="B Lotus"/>
+                <w:szCs w:val="20"/>
+                <w:rtl/>
+              </w:rPr>
+              <w:t xml:space="preserve"> در داده‌های پیوست وجود دارند و </w:t>
+            </w:r>
+            <w:r>
+              <w:rPr>
+                <w:rFonts w:ascii="Times New Roman" w:hAnsi="Times New Roman" w:cs="B Lotus"/>
+                <w:szCs w:val="20"/>
+              </w:rPr>
+              <w:t xml:space="preserve">COSTP</w:t>
+            </w:r>
+            <w:r>
+              <w:rPr>
+                <w:rFonts w:ascii="Times New Roman" w:hAnsi="Times New Roman" w:cs="B Lotus"/>
+                <w:szCs w:val="20"/>
+                <w:rtl/>
+              </w:rPr>
+              <w:t xml:space="preserve"> برای 847 مشاهده محاسبه شده است. تعریف نسبتی </w:t>
+            </w:r>
+            <w:r>
+              <w:rPr>
+                <w:rFonts w:ascii="Times New Roman" w:hAnsi="Times New Roman" w:cs="B Lotus"/>
+                <w:szCs w:val="20"/>
+              </w:rPr>
+              <w:t xml:space="preserve">COMPLEX</w:t>
+            </w:r>
+            <w:r>
+              <w:rPr>
+                <w:rFonts w:ascii="Times New Roman" w:hAnsi="Times New Roman" w:cs="B Lotus"/>
+                <w:szCs w:val="20"/>
+                <w:rtl/>
+              </w:rPr>
+              <w:t xml:space="preserve"> با آمار توصیفی (1.216 تا 2.767) سازگار نبود و در متن به «شاخص پیوستهٔ اندازهٔ نسبی صاحبکار بر پایهٔ لگاریتم دارایی‌ها» اصلاح شد؛ فرمول دقیق ساخت </w:t>
+            </w:r>
+            <w:r>
+              <w:rPr>
+                <w:rFonts w:ascii="Times New Roman" w:hAnsi="Times New Roman" w:cs="B Lotus"/>
+                <w:szCs w:val="20"/>
+              </w:rPr>
+              <w:t xml:space="preserve">COMPLEX</w:t>
+            </w:r>
+            <w:r>
+              <w:rPr>
+                <w:rFonts w:ascii="Times New Roman" w:hAnsi="Times New Roman" w:cs="B Lotus"/>
+                <w:szCs w:val="20"/>
+                <w:rtl/>
+              </w:rPr>
+              <w:t xml:space="preserve"> و نمونهٔ برآورد مدل 3-1 را دانشجو باید از فایل داده تأیید کند (میانگین </w:t>
+            </w:r>
+            <w:r>
+              <w:rPr>
+                <w:rFonts w:ascii="Times New Roman" w:hAnsi="Times New Roman" w:cs="B Lotus"/>
+                <w:szCs w:val="20"/>
+              </w:rPr>
+              <w:t xml:space="preserve">COSTP</w:t>
+            </w:r>
+            <w:r>
+              <w:rPr>
+                <w:rFonts w:ascii="Times New Roman" w:hAnsi="Times New Roman" w:cs="B Lotus"/>
+                <w:szCs w:val="20"/>
+                <w:rtl/>
+              </w:rPr>
+              <w:t xml:space="preserve"> برابر 0.025 است، نه صفر).</w:t>
             </w:r>
           </w:p>
         </w:tc>
@@ -4715,14 +5234,14 @@
                 <w:szCs w:val="20"/>
                 <w:rtl/>
               </w:rPr>
-              <w:t xml:space="preserve">تعریف </w:t>
-            </w:r>
-            <w:r>
-              <w:rPr>
-                <w:rFonts w:ascii="Times New Roman" w:hAnsi="Times New Roman" w:cs="B Lotus"/>
-                <w:szCs w:val="20"/>
-              </w:rPr>
-              <w:t xml:space="preserve">COMPLEX</w:t>
+              <w:t xml:space="preserve">واحد و پایهٔ لگاریتم </w:t>
+            </w:r>
+            <w:r>
+              <w:rPr>
+                <w:rFonts w:ascii="Times New Roman" w:hAnsi="Times New Roman" w:cs="B Lotus"/>
+                <w:szCs w:val="20"/>
+              </w:rPr>
+              <w:t xml:space="preserve">AF</w:t>
             </w:r>
           </w:p>
         </w:tc>
@@ -4743,7 +5262,22 @@
                 <w:szCs w:val="20"/>
                 <w:rtl/>
               </w:rPr>
-              <w:t xml:space="preserve">در متن «اهمیت مشتری» و در جدول‌های قبلی «پیچیدگی شرکت» نامیده شده و آمار توصیفی (بین 1.2 تا 2.8) با تعریف نسبتی (کمتر از 1) سازگار نیست. تعریف عملیاتی را با فایل داده تطبیق دهید.</w:t>
+              <w:t xml:space="preserve">میانگین </w:t>
+            </w:r>
+            <w:r>
+              <w:rPr>
+                <w:rFonts w:ascii="Times New Roman" w:hAnsi="Times New Roman" w:cs="B Lotus"/>
+                <w:szCs w:val="20"/>
+              </w:rPr>
+              <w:t xml:space="preserve">AF=1.26</w:t>
+            </w:r>
+            <w:r>
+              <w:rPr>
+                <w:rFonts w:ascii="Times New Roman" w:hAnsi="Times New Roman" w:cs="B Lotus"/>
+                <w:szCs w:val="20"/>
+                <w:rtl/>
+              </w:rPr>
+              <w:t xml:space="preserve"> با «لگاریتم طبیعی میلیون ریال» همخوان به نظر نمی‌رسد؛ پایه و واحد در متن ذکر نشد.</w:t>
             </w:r>
           </w:p>
         </w:tc>
@@ -4790,14 +5324,7 @@
                 <w:szCs w:val="20"/>
                 <w:rtl/>
               </w:rPr>
-              <w:t xml:space="preserve">مدل هزینهٔ سال اول (</w:t>
-            </w:r>
-            <w:r>
-              <w:rPr>
-                <w:rFonts w:ascii="Times New Roman" w:hAnsi="Times New Roman" w:cs="B Lotus"/>
-                <w:szCs w:val="20"/>
-              </w:rPr>
-              <w:t xml:space="preserve">COSTP)</w:t>
+              <w:t xml:space="preserve">آزمون‌های مدل 5</w:t>
             </w:r>
           </w:p>
         </w:tc>
@@ -4818,7 +5345,7 @@
                 <w:szCs w:val="20"/>
                 <w:rtl/>
               </w:rPr>
-              <w:t xml:space="preserve">مدل 3-1 بر پایهٔ توصیف متن قبلی («باقیمانده مدل هزینهٔ سال اول») نوشته شد؛ متغیرهای مدل و نمونهٔ برآورد را با فایل داده تطبیق دهید.</w:t>
+              <w:t xml:space="preserve">نتایج آزمون‌های کائو، وایت و بروش-گادفری برای مدل 5 در جدول‌ها گزارش نشده است؛ در صورت وجود، اضافه شود.</w:t>
             </w:r>
           </w:p>
         </w:tc>
@@ -4865,14 +5392,7 @@
                 <w:szCs w:val="20"/>
                 <w:rtl/>
               </w:rPr>
-              <w:t xml:space="preserve">واحد و پایهٔ لگاریتم </w:t>
-            </w:r>
-            <w:r>
-              <w:rPr>
-                <w:rFonts w:ascii="Times New Roman" w:hAnsi="Times New Roman" w:cs="B Lotus"/>
-                <w:szCs w:val="20"/>
-              </w:rPr>
-              <w:t xml:space="preserve">AF</w:t>
+              <w:t xml:space="preserve">منابع حذف‌شده</w:t>
             </w:r>
           </w:p>
         </w:tc>
@@ -4893,22 +5413,7 @@
                 <w:szCs w:val="20"/>
                 <w:rtl/>
               </w:rPr>
-              <w:t xml:space="preserve">میانگین </w:t>
-            </w:r>
-            <w:r>
-              <w:rPr>
-                <w:rFonts w:ascii="Times New Roman" w:hAnsi="Times New Roman" w:cs="B Lotus"/>
-                <w:szCs w:val="20"/>
-              </w:rPr>
-              <w:t xml:space="preserve">AF=1.26</w:t>
-            </w:r>
-            <w:r>
-              <w:rPr>
-                <w:rFonts w:ascii="Times New Roman" w:hAnsi="Times New Roman" w:cs="B Lotus"/>
-                <w:szCs w:val="20"/>
-                <w:rtl/>
-              </w:rPr>
-              <w:t xml:space="preserve"> با «لگاریتم طبیعی میلیون ریال» همخوان به نظر نمی‌رسد؛ پایه و واحد در متن ذکر نشد.</w:t>
+              <w:t xml:space="preserve">ارجاعات زیر به منبع قابل شناسایی منتهی نشدند و از متن حذف شدند؛ در صورت داشتن مدرک واقعی منبع، می‌توان با مشخصات کامل بازگرداند: احمدی و همکاران، جمشیدی نوید و محمدی، حساس یگانه و علوی طبری، خدادادی و حاجی زاده، دبی لاشر، دگلاس، رضایی و بیاتی، رضایی و همکاران، زارع و همکاران، زمانی و بیاتی، زمانی و همکاران، سعیدی و همکاران، شاه حیدری پور و شعبانی، صادقی و همکاران، صالحی و همکاران، طاهری و همکاران، عباسی و همکاران، علوی و بیاتی، قاسمی و بیاتی، محمدی و همکاران، مرادی و همکاران، مشکاتی و همکاران، مقداری و همکاران، مهدوی و همکاران، موسوی و داروغه حضرتی، موسوی و همکاران، نظری و همکاران، پارسا و همکاران، چارلز و همکاران، کریمی و همکاران، گیست</w:t>
             </w:r>
           </w:p>
         </w:tc>
@@ -4955,7 +5460,7 @@
                 <w:szCs w:val="20"/>
                 <w:rtl/>
               </w:rPr>
-              <w:t xml:space="preserve">آزمون‌های مدل 5</w:t>
+              <w:t xml:space="preserve">منابع جدید</w:t>
             </w:r>
           </w:p>
         </w:tc>
@@ -4976,211 +5481,7 @@
                 <w:szCs w:val="20"/>
                 <w:rtl/>
               </w:rPr>
-              <w:t xml:space="preserve">نتایج آزمون‌های کائو، وایت و بروش-گادفری برای مدل 5 در جدول‌ها گزارش نشده است؛ در صورت وجود، اضافه شود.</w:t>
-            </w:r>
-          </w:p>
-        </w:tc>
-      </w:tr>
-      <w:tr>
-        <w:trPr>
-          <w:cantSplit/>
-        </w:trPr>
-        <w:tc>
-          <w:tcPr>
-            <w:tcW w:w="800" w:type="dxa"/>
-            <w:vAlign w:val="center"/>
-          </w:tcPr>
-          <w:p>
-            <w:pPr>
-              <w:bidi/>
-              <w:spacing w:before="40" w:after="40" w:line="260" w:lineRule="auto"/>
-              <w:jc w:val="center"/>
-            </w:pPr>
-            <w:r>
-              <w:rPr>
-                <w:rFonts w:ascii="Times New Roman" w:hAnsi="Times New Roman" w:cs="B Lotus"/>
-                <w:szCs w:val="20"/>
-                <w:rtl/>
-              </w:rPr>
-              <w:t xml:space="preserve">7</w:t>
-            </w:r>
-          </w:p>
-        </w:tc>
-        <w:tc>
-          <w:tcPr>
-            <w:tcW w:w="3000" w:type="dxa"/>
-            <w:vAlign w:val="center"/>
-          </w:tcPr>
-          <w:p>
-            <w:pPr>
-              <w:bidi/>
-              <w:spacing w:before="40" w:after="40" w:line="260" w:lineRule="auto"/>
-              <w:jc w:val="both"/>
-            </w:pPr>
-            <w:r>
-              <w:rPr>
-                <w:rFonts w:ascii="Times New Roman" w:hAnsi="Times New Roman" w:cs="B Lotus"/>
-                <w:szCs w:val="20"/>
-                <w:rtl/>
-              </w:rPr>
-              <w:t xml:space="preserve">منابع حذف‌شده</w:t>
-            </w:r>
-          </w:p>
-        </w:tc>
-        <w:tc>
-          <w:tcPr>
-            <w:tcW w:w="10100" w:type="dxa"/>
-            <w:vAlign w:val="center"/>
-          </w:tcPr>
-          <w:p>
-            <w:pPr>
-              <w:bidi/>
-              <w:spacing w:before="40" w:after="40" w:line="260" w:lineRule="auto"/>
-              <w:jc w:val="both"/>
-            </w:pPr>
-            <w:r>
-              <w:rPr>
-                <w:rFonts w:ascii="Times New Roman" w:hAnsi="Times New Roman" w:cs="B Lotus"/>
-                <w:szCs w:val="20"/>
-                <w:rtl/>
-              </w:rPr>
-              <w:t xml:space="preserve">ارجاعات زیر به منبع قابل شناسایی منتهی نشدند و از متن حذف شدند؛ در صورت داشتن مدرک واقعی منبع، می‌توان با مشخصات کامل بازگرداند: احمدی و همکاران، جمشیدی نوید و محمدی، حساس یگانه و علوی طبری، خدادادی و حاجی زاده، دبی لاشر، دگلاس، رضایی و بیاتی، رضایی و همکاران، زارع و همکاران، زمانی و بیاتی، زمانی و همکاران، سعیدی و همکاران، شاه حیدری پور و شعبانی، صادقی و همکاران، صالحی و همکاران، طاهری و همکاران، عباسی و همکاران، علوی و بیاتی، قاسمی و بیاتی، محمدی و همکاران، مرادی و همکاران، مشکاتی و همکاران، مقداری و همکاران، مهدوی و همکاران، موسوی و داروغه حضرتی، موسوی و همکاران، نظری و همکاران، پارسا و همکاران، چارلز و همکاران، کریمی و همکاران، گیست</w:t>
-            </w:r>
-          </w:p>
-        </w:tc>
-      </w:tr>
-      <w:tr>
-        <w:trPr>
-          <w:cantSplit/>
-        </w:trPr>
-        <w:tc>
-          <w:tcPr>
-            <w:tcW w:w="800" w:type="dxa"/>
-            <w:vAlign w:val="center"/>
-          </w:tcPr>
-          <w:p>
-            <w:pPr>
-              <w:bidi/>
-              <w:spacing w:before="40" w:after="40" w:line="260" w:lineRule="auto"/>
-              <w:jc w:val="center"/>
-            </w:pPr>
-            <w:r>
-              <w:rPr>
-                <w:rFonts w:ascii="Times New Roman" w:hAnsi="Times New Roman" w:cs="B Lotus"/>
-                <w:szCs w:val="20"/>
-                <w:rtl/>
-              </w:rPr>
-              <w:t xml:space="preserve">8</w:t>
-            </w:r>
-          </w:p>
-        </w:tc>
-        <w:tc>
-          <w:tcPr>
-            <w:tcW w:w="3000" w:type="dxa"/>
-            <w:vAlign w:val="center"/>
-          </w:tcPr>
-          <w:p>
-            <w:pPr>
-              <w:bidi/>
-              <w:spacing w:before="40" w:after="40" w:line="260" w:lineRule="auto"/>
-              <w:jc w:val="both"/>
-            </w:pPr>
-            <w:r>
-              <w:rPr>
-                <w:rFonts w:ascii="Times New Roman" w:hAnsi="Times New Roman" w:cs="B Lotus"/>
-                <w:szCs w:val="20"/>
-                <w:rtl/>
-              </w:rPr>
-              <w:t xml:space="preserve">منابع جدید</w:t>
-            </w:r>
-          </w:p>
-        </w:tc>
-        <w:tc>
-          <w:tcPr>
-            <w:tcW w:w="10100" w:type="dxa"/>
-            <w:vAlign w:val="center"/>
-          </w:tcPr>
-          <w:p>
-            <w:pPr>
-              <w:bidi/>
-              <w:spacing w:before="40" w:after="40" w:line="260" w:lineRule="auto"/>
-              <w:jc w:val="both"/>
-            </w:pPr>
-            <w:r>
-              <w:rPr>
-                <w:rFonts w:ascii="Times New Roman" w:hAnsi="Times New Roman" w:cs="B Lotus"/>
-                <w:szCs w:val="20"/>
-                <w:rtl/>
-              </w:rPr>
               <w:t xml:space="preserve">مشخصات نشریه/شماره/صفحهٔ مقالهٔ رشیدی و حاجی‌زاده (1403)، نام کوچک نویسندگان امر و یوآن (2025) و شماره/صفحهٔ نواک و نچل (2023) را از سایت نشریه تکمیل کنید. عنوان کامل نیک‌بخت و محمودی‌خوش‌رو (1396) نیز بازبینی شود.</w:t>
-            </w:r>
-          </w:p>
-        </w:tc>
-      </w:tr>
-      <w:tr>
-        <w:trPr>
-          <w:cantSplit/>
-        </w:trPr>
-        <w:tc>
-          <w:tcPr>
-            <w:tcW w:w="800" w:type="dxa"/>
-            <w:vAlign w:val="center"/>
-          </w:tcPr>
-          <w:p>
-            <w:pPr>
-              <w:bidi/>
-              <w:spacing w:before="40" w:after="40" w:line="260" w:lineRule="auto"/>
-              <w:jc w:val="center"/>
-            </w:pPr>
-            <w:r>
-              <w:rPr>
-                <w:rFonts w:ascii="Times New Roman" w:hAnsi="Times New Roman" w:cs="B Lotus"/>
-                <w:szCs w:val="20"/>
-                <w:rtl/>
-              </w:rPr>
-              <w:t xml:space="preserve">9</w:t>
-            </w:r>
-          </w:p>
-        </w:tc>
-        <w:tc>
-          <w:tcPr>
-            <w:tcW w:w="3000" w:type="dxa"/>
-            <w:vAlign w:val="center"/>
-          </w:tcPr>
-          <w:p>
-            <w:pPr>
-              <w:bidi/>
-              <w:spacing w:before="40" w:after="40" w:line="260" w:lineRule="auto"/>
-              <w:jc w:val="both"/>
-            </w:pPr>
-            <w:r>
-              <w:rPr>
-                <w:rFonts w:ascii="Times New Roman" w:hAnsi="Times New Roman" w:cs="B Lotus"/>
-                <w:szCs w:val="20"/>
-                <w:rtl/>
-              </w:rPr>
-              <w:t xml:space="preserve">بخش نوآوری فصل 1</w:t>
-            </w:r>
-          </w:p>
-        </w:tc>
-        <w:tc>
-          <w:tcPr>
-            <w:tcW w:w="10100" w:type="dxa"/>
-            <w:vAlign w:val="center"/>
-          </w:tcPr>
-          <w:p>
-            <w:pPr>
-              <w:bidi/>
-              <w:spacing w:before="40" w:after="40" w:line="260" w:lineRule="auto"/>
-              <w:jc w:val="both"/>
-            </w:pPr>
-            <w:r>
-              <w:rPr>
-                <w:rFonts w:ascii="Times New Roman" w:hAnsi="Times New Roman" w:cs="B Lotus"/>
-                <w:szCs w:val="20"/>
-                <w:rtl/>
-              </w:rPr>
-              <w:t xml:space="preserve">بند 1-6 از «روش داده‌بنیاد و بخش کیفی» سخن می‌گوید، در حالی که رساله کاملاً کمّی است؛ اگر بخش کیفی وجود ندارد این بند باید با نوع پژوهش (فصل 3) هماهنگ شود.</w:t>
             </w:r>
           </w:p>
         </w:tc>

</xml_diff>